<commit_message>
content: enrich sample candidate resumes
</commit_message>
<xml_diff>
--- a/public/samples/resume-cv_001.docx
+++ b/public/samples/resume-cv_001.docx
@@ -3,73 +3,246 @@
 <w:document xmlns:wpc="http://schemas.microsoft.com/office/word/2010/wordprocessingCanvas" xmlns:mo="http://schemas.microsoft.com/office/mac/office/2008/main" xmlns:mc="http://schemas.openxmlformats.org/markup-compatibility/2006" xmlns:mv="urn:schemas-microsoft-com:mac:vml" xmlns:o="urn:schemas-microsoft-com:office:office" xmlns:r="http://schemas.openxmlformats.org/officeDocument/2006/relationships" xmlns:m="http://schemas.openxmlformats.org/officeDocument/2006/math" xmlns:v="urn:schemas-microsoft-com:vml" xmlns:wp14="http://schemas.microsoft.com/office/word/2010/wordprocessingDrawing" xmlns:wp="http://schemas.openxmlformats.org/drawingml/2006/wordprocessingDrawing" xmlns:w10="urn:schemas-microsoft-com:office:word" xmlns:w="http://schemas.openxmlformats.org/wordprocessingml/2006/main" xmlns:w14="http://schemas.microsoft.com/office/word/2010/wordml" xmlns:wpg="http://schemas.microsoft.com/office/word/2010/wordprocessingGroup" xmlns:wpi="http://schemas.microsoft.com/office/word/2010/wordprocessingInk" xmlns:wne="http://schemas.microsoft.com/office/word/2006/wordml" xmlns:wps="http://schemas.microsoft.com/office/word/2010/wordprocessingShape" mc:Ignorable="w14 wp14">
   <w:body>
     <w:p>
+      <w:pPr>
+        <w:spacing w:after="60"/>
+      </w:pPr>
       <w:r>
-        <w:t>姓名：林知远</w:t>
+        <w:rPr>
+          <w:b/>
+          <w:color w:val="111111"/>
+          <w:sz w:val="48"/>
+        </w:rPr>
+        <w:t>林知远</w:t>
+      </w:r>
+    </w:p>
+    <w:p>
+      <w:pPr>
+        <w:spacing w:after="240"/>
+      </w:pPr>
+      <w:r>
+        <w:rPr>
+          <w:color w:val="555555"/>
+          <w:sz w:val="20"/>
+        </w:rPr>
+        <w:t>求职意向：AI Agent / LLM 应用工程师　｜　5 年经验　｜　期望：30-45K</w:t>
+      </w:r>
+    </w:p>
+    <w:p>
+      <w:pPr>
+        <w:pStyle w:val="Heading1"/>
+      </w:pPr>
+      <w:r>
+        <w:t>个人概况</w:t>
       </w:r>
     </w:p>
     <w:p>
       <w:r>
-        <w:t>求职意向：AI Agent / LLM 应用工程师</w:t>
+        <w:t>5 年 Python 开发经验，近 4 年专注 LLM 应用与 Agent 生产落地。擅长把复杂业务流程拆成可观测、可回滚的工具调用链路，能够同时承担方案设计、工程实现和上线评测。</w:t>
       </w:r>
     </w:p>
     <w:p>
+      <w:pPr>
+        <w:pStyle w:val="Heading1"/>
+      </w:pPr>
       <w:r>
-        <w:t>教育经历：东湖理工大学 计算机科学与技术 本科 2016-2020</w:t>
+        <w:t>工作经历</w:t>
       </w:r>
     </w:p>
     <w:p>
+      <w:pPr>
+        <w:pStyle w:val="Heading2"/>
+      </w:pPr>
       <w:r>
-        <w:t>工作经历：</w:t>
+        <w:t>澄空智能｜Agent 平台工程师｜2021.03-至今</w:t>
       </w:r>
     </w:p>
     <w:p>
+      <w:pPr>
+        <w:pStyle w:val="ListBullet"/>
+      </w:pPr>
       <w:r>
-        <w:t>澄空智能 | Agent 平台工程师 | 2021.03-至今</w:t>
+        <w:t>主导工单处理 Multi-Agent 的架构与落地，设计规划器、执行器、质检器和人工接管节点，覆盖售后、权限申请与异常排查等 6 类流程。</w:t>
       </w:r>
     </w:p>
     <w:p>
+      <w:pPr>
+        <w:pStyle w:val="ListBullet"/>
+      </w:pPr>
       <w:r>
-        <w:t>主导设计了工单处理 Multi-Agent：拆解、指派、工具调用与人工接管。使用 LangChain 与自研编排层对接 20+ 内部 API，统一 Function Calling 协议（鉴权、幂等、超时重试）。负责 Prompt Engineering 与评测集建设，将工具误调用率从 11% 降至 3.2%。</w:t>
+        <w:t>使用 LangChain 与自研编排层接入 20+ 内部 API，统一 Function Calling 协议中的鉴权、参数校验、幂等键、超时重试和降级策略。</w:t>
       </w:r>
     </w:p>
     <w:p>
+      <w:pPr>
+        <w:pStyle w:val="ListBullet"/>
+      </w:pPr>
       <w:r>
-        <w:t>拾光纪科技 | Python 后端工程师 | 2020.07-2021.03</w:t>
+        <w:t>建立 480 条核心任务评测集及每日回归机制，将工具误调用率从 11% 降至 3.2%，关键流程一次完成率提升至 86%。</w:t>
       </w:r>
     </w:p>
     <w:p>
+      <w:pPr>
+        <w:pStyle w:val="ListBullet"/>
+      </w:pPr>
       <w:r>
-        <w:t>用 Python 维护客服中台接口与审计日志，为后续 Agent 化改造打底。</w:t>
+        <w:t>补齐 OpenTelemetry tracing、调用成本看板和失败样本归因，线上问题平均定位时间由 45 分钟缩短到 12 分钟。</w:t>
       </w:r>
     </w:p>
     <w:p>
+      <w:pPr>
+        <w:pStyle w:val="ListBullet"/>
+      </w:pPr>
       <w:r>
-        <w:t>项目：</w:t>
+        <w:t>与产品、客服和安全团队共同定义高风险写操作的审批边界，推动 Agent 从 30 人试点扩展到 600+ 名内部用户。</w:t>
       </w:r>
     </w:p>
     <w:p>
+      <w:pPr>
+        <w:pStyle w:val="Heading2"/>
+      </w:pPr>
       <w:r>
-        <w:t>「澄助手」企业内部 Copilot，支持查库、提单、改权限，日均调用约 1.2 万次。多 Agent 协作编排器实现规划-执行-反思循环，支持并行工具调用。</w:t>
+        <w:t>拾光纪科技｜Python 后端工程师｜2020.07-2021.03</w:t>
       </w:r>
     </w:p>
     <w:p>
+      <w:pPr>
+        <w:pStyle w:val="ListBullet"/>
+      </w:pPr>
       <w:r>
-        <w:t>技能：Python、LangChain、Function Calling、Multi-Agent、Prompt Engineering、FastAPI、LangGraph</w:t>
+        <w:t>负责客服中台的工单、用户画像与审计日志接口，使用 FastAPI、PostgreSQL 和 Redis 支撑日均约 8 万次请求。</w:t>
       </w:r>
     </w:p>
     <w:p>
+      <w:pPr>
+        <w:pStyle w:val="ListBullet"/>
+      </w:pPr>
       <w:r>
-        <w:t>合计 5 年 Python 开发，近 4 年专注 LLM 应用与 Agent 生产落地。</w:t>
+        <w:t>梳理 12 个内部系统的权限与错误码规范，为后续将业务能力封装成 Agent 工具打下基础。</w:t>
+      </w:r>
+    </w:p>
+    <w:p>
+      <w:pPr>
+        <w:pStyle w:val="Heading1"/>
+      </w:pPr>
+      <w:r>
+        <w:t>项目经历</w:t>
+      </w:r>
+    </w:p>
+    <w:p>
+      <w:pPr>
+        <w:pStyle w:val="Heading2"/>
+      </w:pPr>
+      <w:r>
+        <w:t>“澄助手”企业内部 Copilot｜技术负责人</w:t>
+      </w:r>
+    </w:p>
+    <w:p>
+      <w:pPr>
+        <w:pStyle w:val="ListBullet"/>
+      </w:pPr>
+      <w:r>
+        <w:t>支持查库、提单、改权限和生成排障报告，日均调用约 1.2 万次，月度活跃率稳定在 71%。</w:t>
+      </w:r>
+    </w:p>
+    <w:p>
+      <w:pPr>
+        <w:pStyle w:val="ListBullet"/>
+      </w:pPr>
+      <w:r>
+        <w:t>实现规划—执行—反思循环与并行工具调用；当置信度低或写操作风险高时自动转人工审批。</w:t>
+      </w:r>
+    </w:p>
+    <w:p>
+      <w:pPr>
+        <w:pStyle w:val="ListBullet"/>
+      </w:pPr>
+      <w:r>
+        <w:t>将提示词、工具 Schema 和评测基线纳入版本管理，发布时自动执行离线回归与 5% 灰度验证。</w:t>
+      </w:r>
+    </w:p>
+    <w:p>
+      <w:pPr>
+        <w:pStyle w:val="Heading1"/>
+      </w:pPr>
+      <w:r>
+        <w:t>专业技能</w:t>
+      </w:r>
+    </w:p>
+    <w:p>
+      <w:pPr>
+        <w:pStyle w:val="ListBullet"/>
+      </w:pPr>
+      <w:r>
+        <w:t>语言与框架：Python、FastAPI、Pydantic、LangChain、LangGraph</w:t>
+      </w:r>
+    </w:p>
+    <w:p>
+      <w:pPr>
+        <w:pStyle w:val="ListBullet"/>
+      </w:pPr>
+      <w:r>
+        <w:t>Agent 工程：Function Calling、Multi-Agent、Prompt Engineering、MCP、RAG</w:t>
+      </w:r>
+    </w:p>
+    <w:p>
+      <w:pPr>
+        <w:pStyle w:val="ListBullet"/>
+      </w:pPr>
+      <w:r>
+        <w:t>数据与基础设施：PostgreSQL、Redis、Docker、OpenTelemetry、GitHub Actions</w:t>
+      </w:r>
+    </w:p>
+    <w:p>
+      <w:pPr>
+        <w:pStyle w:val="ListBullet"/>
+      </w:pPr>
+      <w:r>
+        <w:t>工作方式：需求拆解、技术方案评审、跨团队协作、线上故障复盘</w:t>
+      </w:r>
+    </w:p>
+    <w:p>
+      <w:pPr>
+        <w:pStyle w:val="Heading1"/>
+      </w:pPr>
+      <w:r>
+        <w:t>教育经历</w:t>
+      </w:r>
+    </w:p>
+    <w:p>
+      <w:pPr>
+        <w:pStyle w:val="ListBullet"/>
+      </w:pPr>
+      <w:r>
+        <w:t>东湖理工大学｜计算机科学与技术｜本科｜2016.09-2020.06</w:t>
       </w:r>
     </w:p>
     <w:sectPr>
+      <w:footerReference w:type="default" r:id="rId9"/>
       <w:pgSz w:w="12240" w:h="15840"/>
-      <w:pgMar w:top="1440" w:right="1800" w:bottom="1440" w:left="1800" w:header="720" w:footer="720" w:gutter="0"/>
+      <w:pgMar w:top="1440" w:right="1440" w:bottom="1440" w:left="1440" w:header="708" w:footer="708" w:gutter="0"/>
       <w:cols w:space="720"/>
       <w:docGrid w:linePitch="360"/>
     </w:sectPr>
   </w:body>
 </w:document>
+</file>
+
+<file path=word/footer1.xml><?xml version="1.0" encoding="utf-8"?>
+<w:ftr xmlns:m="http://schemas.openxmlformats.org/officeDocument/2006/math" xmlns:mc="http://schemas.openxmlformats.org/markup-compatibility/2006" xmlns:mo="http://schemas.microsoft.com/office/mac/office/2008/main" xmlns:mv="urn:schemas-microsoft-com:mac:vml" xmlns:o="urn:schemas-microsoft-com:office:office" xmlns:r="http://schemas.openxmlformats.org/officeDocument/2006/relationships" xmlns:v="urn:schemas-microsoft-com:vml" xmlns:w10="urn:schemas-microsoft-com:office:word" xmlns:w14="http://schemas.microsoft.com/office/word/2010/wordml" xmlns:w="http://schemas.openxmlformats.org/wordprocessingml/2006/main" xmlns:wne="http://schemas.microsoft.com/office/word/2006/wordml" xmlns:wp14="http://schemas.microsoft.com/office/word/2010/wordprocessingDrawing" xmlns:wp="http://schemas.openxmlformats.org/drawingml/2006/wordprocessingDrawing" xmlns:wpc="http://schemas.microsoft.com/office/word/2010/wordprocessingCanvas" xmlns:wpg="http://schemas.microsoft.com/office/word/2010/wordprocessingGroup" xmlns:wpi="http://schemas.microsoft.com/office/word/2010/wordprocessingInk" xmlns:wps="http://schemas.microsoft.com/office/word/2010/wordprocessingShape" mc:Ignorable="w14 wp14">
+  <w:p>
+    <w:pPr>
+      <w:pStyle w:val="Footer"/>
+      <w:jc w:val="center"/>
+    </w:pPr>
+    <w:r>
+      <w:rPr>
+        <w:color w:val="7D7D7D"/>
+        <w:sz w:val="18"/>
+      </w:rPr>
+      <w:t>简历中台公开演示样例 · 人物、组织与数据均为虚构</w:t>
+    </w:r>
+  </w:p>
+</w:ftr>
 </file>
 
 <file path=word/numbering.xml><?xml version="1.0" encoding="utf-8"?>
@@ -435,6 +608,12 @@
     <w:name w:val="Normal"/>
     <w:qFormat/>
     <w:rsid w:val="00FC693F"/>
+    <w:pPr>
+      <w:spacing w:after="120" w:line="300" w:lineRule="auto"/>
+    </w:pPr>
+    <w:rPr>
+      <w:sz w:val="22"/>
+    </w:rPr>
   </w:style>
   <w:style w:type="paragraph" w:styleId="Header">
     <w:name w:val="header"/>
@@ -491,15 +670,15 @@
     <w:pPr>
       <w:keepNext/>
       <w:keepLines/>
-      <w:spacing w:before="480" w:after="0"/>
+      <w:spacing w:before="360" w:after="200"/>
       <w:outlineLvl w:val="0"/>
     </w:pPr>
     <w:rPr>
       <w:rFonts w:asciiTheme="majorHAnsi" w:eastAsiaTheme="majorEastAsia" w:hAnsiTheme="majorHAnsi" w:cstheme="majorBidi"/>
       <w:b/>
       <w:bCs/>
-      <w:color w:val="365F91" w:themeColor="accent1" w:themeShade="BF"/>
-      <w:sz w:val="28"/>
+      <w:color w:val="2E74B5"/>
+      <w:sz w:val="32"/>
       <w:szCs w:val="28"/>
     </w:rPr>
   </w:style>
@@ -515,14 +694,14 @@
     <w:pPr>
       <w:keepNext/>
       <w:keepLines/>
-      <w:spacing w:before="200" w:after="0"/>
+      <w:spacing w:before="280" w:after="140"/>
       <w:outlineLvl w:val="1"/>
     </w:pPr>
     <w:rPr>
       <w:rFonts w:asciiTheme="majorHAnsi" w:eastAsiaTheme="majorEastAsia" w:hAnsiTheme="majorHAnsi" w:cstheme="majorBidi"/>
       <w:b/>
       <w:bCs/>
-      <w:color w:val="4F81BD" w:themeColor="accent1"/>
+      <w:color w:val="2E74B5"/>
       <w:sz w:val="26"/>
       <w:szCs w:val="26"/>
     </w:rPr>
@@ -539,14 +718,15 @@
     <w:pPr>
       <w:keepNext/>
       <w:keepLines/>
-      <w:spacing w:before="200" w:after="0"/>
+      <w:spacing w:before="200" w:after="100"/>
       <w:outlineLvl w:val="2"/>
     </w:pPr>
     <w:rPr>
       <w:rFonts w:asciiTheme="majorHAnsi" w:eastAsiaTheme="majorEastAsia" w:hAnsiTheme="majorHAnsi" w:cstheme="majorBidi"/>
       <w:b/>
       <w:bCs/>
-      <w:color w:val="4F81BD" w:themeColor="accent1"/>
+      <w:color w:val="1F4D78"/>
+      <w:sz w:val="24"/>
     </w:rPr>
   </w:style>
   <w:style w:type="paragraph" w:styleId="Heading4">
@@ -962,8 +1142,13 @@
       <w:numPr>
         <w:numId w:val="1"/>
       </w:numPr>
+      <w:spacing w:after="80" w:line="300" w:lineRule="auto"/>
+      <w:ind w:left="540" w:hanging="271"/>
       <w:contextualSpacing/>
     </w:pPr>
+    <w:rPr>
+      <w:sz w:val="22"/>
+    </w:rPr>
   </w:style>
   <w:style w:type="paragraph" w:styleId="ListBullet2">
     <w:name w:val="List Bullet 2"/>

</xml_diff>

<commit_message>
fix: align enriched resume evaluation labels
</commit_message>
<xml_diff>
--- a/public/samples/resume-cv_001.docx
+++ b/public/samples/resume-cv_001.docx
@@ -53,7 +53,7 @@
         <w:pStyle w:val="Heading2"/>
       </w:pPr>
       <w:r>
-        <w:t>澄空智能｜Agent 平台工程师｜2021.03-至今</w:t>
+        <w:t>澄空智能｜Agent 平台工程师｜2021.09-至今</w:t>
       </w:r>
     </w:p>
     <w:p>
@@ -213,7 +213,7 @@
         <w:pStyle w:val="ListBullet"/>
       </w:pPr>
       <w:r>
-        <w:t>东湖理工大学｜计算机科学与技术｜本科｜2016.09-2020.06</w:t>
+        <w:t>东湖理工大学｜计算机科学与技术｜本科</w:t>
       </w:r>
     </w:p>
     <w:sectPr>

</xml_diff>